<commit_message>
Brand Book allineato ai colori veri dell'app
Il manuale dichiarava neri caldi (#0D0D0B/#1A1A14/#2A2A1F) e alcuni
valori presi da palette generiche. L'app usa neri neutri e ha le sue
scelte, alcune migliori di quelle che avevo scritto: i grigi del testo
sono bianco con trasparenza, non grigi fissi, cosi' lo stesso testo
secondario resta corretto sia sul fondo pagina che dentro una card.

Ora il manuale documenta cio' che esiste: i 17 token di camon.html,
uno per uno, con i contrasti ricalcolati sui valori reali.

Aggiunta la sezione "Cosa resta fuori": gli attributi SVG che non
possono usare var(), gli accenti dei singoli giochi (deliberati) e i
grigi minori rimasti. Meglio dichiarare il perimetro che far finta
che sia completo.

Co-Authored-By: Claude Sonnet 4.6 <noreply@anthropic.com>
</commit_message>
<xml_diff>
--- a/brand/CAMON-Brand-Book.docx
+++ b/brand/CAMON-Brand-Book.docx
@@ -2690,7 +2690,7 @@
               <w:bottom w:val="single" w:color="D8D8CC" w:sz="4"/>
               <w:right w:val="single" w:color="D8D8CC" w:sz="4"/>
             </w:tcBorders>
-            <w:shd w:fill="C49A0A" w:color="auto" w:val="clear"/>
+            <w:shd w:fill="D4900A" w:color="auto" w:val="clear"/>
           </w:tcPr>
           <w:p>
             <w:pPr>
@@ -2750,7 +2750,7 @@
                 <w:sz w:val="21"/>
                 <w:szCs w:val="21"/>
               </w:rPr>
-              <w:t xml:space="preserve">YELLOW DARK</w:t>
+              <w:t xml:space="preserve">YELLOW PRESS</w:t>
             </w:r>
           </w:p>
           <w:p>
@@ -2764,7 +2764,7 @@
                 <w:sz w:val="18"/>
                 <w:szCs w:val="18"/>
               </w:rPr>
-              <w:t xml:space="preserve">Lo stato premuto dei bottoni gialli, e il giallo per elementi grandi su fondo chiaro. Non basta per il testo piccolo su bianco — vedi la tabella dei contrasti.</w:t>
+              <w:t xml:space="preserve">Lo stato premuto dei bottoni gialli. Vira leggermente all’arancio: e’ quello che rende evidente il tocco senza cambiare colore. Non usarlo per testo.</w:t>
             </w:r>
           </w:p>
         </w:tc>
@@ -2797,7 +2797,7 @@
                 <w:sz w:val="20"/>
                 <w:szCs w:val="20"/>
               </w:rPr>
-              <w:t xml:space="preserve">#C49A0A</w:t>
+              <w:t xml:space="preserve">#D4900A</w:t>
             </w:r>
           </w:p>
           <w:p>
@@ -2812,7 +2812,7 @@
                 <w:sz w:val="15"/>
                 <w:szCs w:val="15"/>
               </w:rPr>
-              <w:t xml:space="preserve">oklch(65% .17 89)</w:t>
+              <w:t xml:space="preserve">oklch(66% .15 75)</w:t>
             </w:r>
           </w:p>
         </w:tc>
@@ -2827,7 +2827,7 @@
               <w:bottom w:val="single" w:color="D8D8CC" w:sz="4"/>
               <w:right w:val="single" w:color="D8D8CC" w:sz="4"/>
             </w:tcBorders>
-            <w:shd w:fill="3D2F00" w:color="auto" w:val="clear"/>
+            <w:shd w:fill="3A2E00" w:color="auto" w:val="clear"/>
           </w:tcPr>
           <w:p>
             <w:pPr>
@@ -2934,7 +2934,7 @@
                 <w:sz w:val="20"/>
                 <w:szCs w:val="20"/>
               </w:rPr>
-              <w:t xml:space="preserve">#3D2F00</w:t>
+              <w:t xml:space="preserve">#3A2E00</w:t>
             </w:r>
           </w:p>
           <w:p>
@@ -2949,7 +2949,7 @@
                 <w:sz w:val="15"/>
                 <w:szCs w:val="15"/>
               </w:rPr>
-              <w:t xml:space="preserve">oklch(22% .08 89)</w:t>
+              <w:t xml:space="preserve">oklch(23% .07 89)</w:t>
             </w:r>
           </w:p>
         </w:tc>
@@ -3141,7 +3141,7 @@
               <w:bottom w:val="single" w:color="D8D8CC" w:sz="4"/>
               <w:right w:val="single" w:color="D8D8CC" w:sz="4"/>
             </w:tcBorders>
-            <w:shd w:fill="0D0D0B" w:color="auto" w:val="clear"/>
+            <w:shd w:fill="0A0A0A" w:color="auto" w:val="clear"/>
           </w:tcPr>
           <w:p>
             <w:pPr>
@@ -3201,7 +3201,7 @@
                 <w:sz w:val="21"/>
                 <w:szCs w:val="21"/>
               </w:rPr>
-              <w:t xml:space="preserve">DARK 950</w:t>
+              <w:t xml:space="preserve">--bg-deep</w:t>
             </w:r>
           </w:p>
           <w:p>
@@ -3215,7 +3215,7 @@
                 <w:sz w:val="18"/>
                 <w:szCs w:val="18"/>
               </w:rPr>
-              <w:t xml:space="preserve">Il fondo di tutto. Non ci si appoggia nulla sopra direttamente tranne il testo.</w:t>
+              <w:t xml:space="preserve">Piu’ scuro della pagina: velatura sotto l’orologio, fondi che devono sprofondare.</w:t>
             </w:r>
           </w:p>
         </w:tc>
@@ -3248,7 +3248,7 @@
                 <w:sz w:val="20"/>
                 <w:szCs w:val="20"/>
               </w:rPr>
-              <w:t xml:space="preserve">#0D0D0B</w:t>
+              <w:t xml:space="preserve">#0A0A0A</w:t>
             </w:r>
           </w:p>
           <w:p>
@@ -3263,7 +3263,7 @@
                 <w:sz w:val="15"/>
                 <w:szCs w:val="15"/>
               </w:rPr>
-              <w:t xml:space="preserve">oklch(8% .01 89)</w:t>
+              <w:t xml:space="preserve">oklch(6% 0 0)</w:t>
             </w:r>
           </w:p>
         </w:tc>
@@ -3278,7 +3278,7 @@
               <w:bottom w:val="single" w:color="D8D8CC" w:sz="4"/>
               <w:right w:val="single" w:color="D8D8CC" w:sz="4"/>
             </w:tcBorders>
-            <w:shd w:fill="1A1A14" w:color="auto" w:val="clear"/>
+            <w:shd w:fill="111111" w:color="auto" w:val="clear"/>
           </w:tcPr>
           <w:p>
             <w:pPr>
@@ -3338,7 +3338,7 @@
                 <w:sz w:val="21"/>
                 <w:szCs w:val="21"/>
               </w:rPr>
-              <w:t xml:space="preserve">DARK 900</w:t>
+              <w:t xml:space="preserve">--bg</w:t>
             </w:r>
           </w:p>
           <w:p>
@@ -3352,7 +3352,7 @@
                 <w:sz w:val="18"/>
                 <w:szCs w:val="18"/>
               </w:rPr>
-              <w:t xml:space="preserve">Tutto ciò che è contenitore: card, drawer, bottom sheet, modali.</w:t>
+              <w:t xml:space="preserve">Il fondo di tutto. Non ci si appoggia nulla sopra direttamente tranne il testo.</w:t>
             </w:r>
           </w:p>
         </w:tc>
@@ -3385,7 +3385,7 @@
                 <w:sz w:val="20"/>
                 <w:szCs w:val="20"/>
               </w:rPr>
-              <w:t xml:space="preserve">#1A1A14</w:t>
+              <w:t xml:space="preserve">#111111</w:t>
             </w:r>
           </w:p>
           <w:p>
@@ -3400,7 +3400,7 @@
                 <w:sz w:val="15"/>
                 <w:szCs w:val="15"/>
               </w:rPr>
-              <w:t xml:space="preserve">oklch(13% .02 89)</w:t>
+              <w:t xml:space="preserve">oklch(18% 0 0)</w:t>
             </w:r>
           </w:p>
         </w:tc>
@@ -3415,7 +3415,7 @@
               <w:bottom w:val="single" w:color="D8D8CC" w:sz="4"/>
               <w:right w:val="single" w:color="D8D8CC" w:sz="4"/>
             </w:tcBorders>
-            <w:shd w:fill="2A2A1F" w:color="auto" w:val="clear"/>
+            <w:shd w:fill="1C1C1C" w:color="auto" w:val="clear"/>
           </w:tcPr>
           <w:p>
             <w:pPr>
@@ -3475,7 +3475,7 @@
                 <w:sz w:val="21"/>
                 <w:szCs w:val="21"/>
               </w:rPr>
-              <w:t xml:space="preserve">DARK 800</w:t>
+              <w:t xml:space="preserve">--surface</w:t>
             </w:r>
           </w:p>
           <w:p>
@@ -3489,7 +3489,7 @@
                 <w:sz w:val="18"/>
                 <w:szCs w:val="18"/>
               </w:rPr>
-              <w:t xml:space="preserve">Bordi, separatori, campi di input, chip non selezionate.</w:t>
+              <w:t xml:space="preserve">Tutto ciò che è contenitore: card, drawer, bottom sheet, modali.</w:t>
             </w:r>
           </w:p>
         </w:tc>
@@ -3522,7 +3522,7 @@
                 <w:sz w:val="20"/>
                 <w:szCs w:val="20"/>
               </w:rPr>
-              <w:t xml:space="preserve">#2A2A1F</w:t>
+              <w:t xml:space="preserve">#1C1C1C</w:t>
             </w:r>
           </w:p>
           <w:p>
@@ -3537,7 +3537,281 @@
                 <w:sz w:val="15"/>
                 <w:szCs w:val="15"/>
               </w:rPr>
-              <w:t xml:space="preserve">oklch(20% .02 89)</w:t>
+              <w:t xml:space="preserve">oklch(24% 0 0)</w:t>
+            </w:r>
+          </w:p>
+        </w:tc>
+      </w:tr>
+      <w:tr>
+        <w:tc>
+          <w:tcPr>
+            <w:tcW w:type="dxa" w:w="900"/>
+            <w:tcBorders>
+              <w:top w:val="single" w:color="D8D8CC" w:sz="4"/>
+              <w:left w:val="single" w:color="D8D8CC" w:sz="4"/>
+              <w:bottom w:val="single" w:color="D8D8CC" w:sz="4"/>
+              <w:right w:val="single" w:color="D8D8CC" w:sz="4"/>
+            </w:tcBorders>
+            <w:shd w:fill="252525" w:color="auto" w:val="clear"/>
+          </w:tcPr>
+          <w:p>
+            <w:pPr>
+              <w:spacing w:after="0" w:before="0" w:line="276"/>
+            </w:pPr>
+            <w:r>
+              <w:rPr>
+                <w:rFonts w:ascii="Calibri" w:cs="Calibri" w:eastAsia="Calibri" w:hAnsi="Calibri"/>
+                <w:color w:val="55554A"/>
+                <w:sz w:val="20"/>
+                <w:szCs w:val="20"/>
+              </w:rPr>
+              <w:t xml:space="preserve"/>
+            </w:r>
+          </w:p>
+          <w:p>
+            <w:pPr>
+              <w:spacing w:after="0" w:before="0" w:line="276"/>
+            </w:pPr>
+            <w:r>
+              <w:rPr>
+                <w:rFonts w:ascii="Calibri" w:cs="Calibri" w:eastAsia="Calibri" w:hAnsi="Calibri"/>
+                <w:color w:val="55554A"/>
+                <w:sz w:val="20"/>
+                <w:szCs w:val="20"/>
+              </w:rPr>
+              <w:t xml:space="preserve"/>
+            </w:r>
+          </w:p>
+        </w:tc>
+        <w:tc>
+          <w:tcPr>
+            <w:tcW w:type="dxa" w:w="5860"/>
+            <w:tcBorders>
+              <w:top w:val="single" w:color="D8D8CC" w:sz="4"/>
+              <w:left w:val="none" w:color="FFFFFF" w:sz="0"/>
+              <w:bottom w:val="single" w:color="D8D8CC" w:sz="4"/>
+              <w:right w:val="none" w:color="FFFFFF" w:sz="0"/>
+            </w:tcBorders>
+            <w:tcMar>
+              <w:top w:type="dxa" w:w="120"/>
+              <w:left w:type="dxa" w:w="200"/>
+              <w:bottom w:type="dxa" w:w="120"/>
+              <w:right w:type="dxa" w:w="160"/>
+            </w:tcMar>
+          </w:tcPr>
+          <w:p>
+            <w:pPr>
+              <w:spacing w:after="40" w:before="0" w:line="276"/>
+            </w:pPr>
+            <w:r>
+              <w:rPr>
+                <w:rFonts w:ascii="Calibri" w:cs="Calibri" w:eastAsia="Calibri" w:hAnsi="Calibri"/>
+                <w:b/>
+                <w:bCs/>
+                <w:color w:val="1A1A14"/>
+                <w:sz w:val="21"/>
+                <w:szCs w:val="21"/>
+              </w:rPr>
+              <w:t xml:space="preserve">--surface-2</w:t>
+            </w:r>
+          </w:p>
+          <w:p>
+            <w:pPr>
+              <w:spacing w:after="0" w:before="0" w:line="276"/>
+            </w:pPr>
+            <w:r>
+              <w:rPr>
+                <w:rFonts w:ascii="Calibri" w:cs="Calibri" w:eastAsia="Calibri" w:hAnsi="Calibri"/>
+                <w:color w:val="55554A"/>
+                <w:sz w:val="18"/>
+                <w:szCs w:val="18"/>
+              </w:rPr>
+              <w:t xml:space="preserve">Un piano piu’ avanti: campi di input, chip non selezionate.</w:t>
+            </w:r>
+          </w:p>
+        </w:tc>
+        <w:tc>
+          <w:tcPr>
+            <w:tcW w:type="dxa" w:w="2600"/>
+            <w:tcBorders>
+              <w:top w:val="single" w:color="D8D8CC" w:sz="4"/>
+              <w:left w:val="single" w:color="D8D8CC" w:sz="4"/>
+              <w:bottom w:val="single" w:color="D8D8CC" w:sz="4"/>
+              <w:right w:val="single" w:color="D8D8CC" w:sz="4"/>
+            </w:tcBorders>
+            <w:shd w:fill="FAFAF6" w:color="auto" w:val="clear"/>
+            <w:tcMar>
+              <w:top w:type="dxa" w:w="120"/>
+              <w:left w:type="dxa" w:w="160"/>
+              <w:bottom w:type="dxa" w:w="120"/>
+              <w:right w:type="dxa" w:w="160"/>
+            </w:tcMar>
+          </w:tcPr>
+          <w:p>
+            <w:pPr>
+              <w:spacing w:after="30" w:before="0" w:line="276"/>
+              <w:jc w:val="right"/>
+            </w:pPr>
+            <w:r>
+              <w:rPr>
+                <w:rFonts w:ascii="Consolas" w:cs="Consolas" w:eastAsia="Consolas" w:hAnsi="Consolas"/>
+                <w:color w:val="1A1A14"/>
+                <w:sz w:val="20"/>
+                <w:szCs w:val="20"/>
+              </w:rPr>
+              <w:t xml:space="preserve">#252525</w:t>
+            </w:r>
+          </w:p>
+          <w:p>
+            <w:pPr>
+              <w:spacing w:after="0" w:before="0" w:line="276"/>
+              <w:jc w:val="right"/>
+            </w:pPr>
+            <w:r>
+              <w:rPr>
+                <w:rFonts w:ascii="Consolas" w:cs="Consolas" w:eastAsia="Consolas" w:hAnsi="Consolas"/>
+                <w:color w:val="8A8A78"/>
+                <w:sz w:val="15"/>
+                <w:szCs w:val="15"/>
+              </w:rPr>
+              <w:t xml:space="preserve">oklch(29% 0 0)</w:t>
+            </w:r>
+          </w:p>
+        </w:tc>
+      </w:tr>
+      <w:tr>
+        <w:tc>
+          <w:tcPr>
+            <w:tcW w:type="dxa" w:w="900"/>
+            <w:tcBorders>
+              <w:top w:val="single" w:color="D8D8CC" w:sz="4"/>
+              <w:left w:val="single" w:color="D8D8CC" w:sz="4"/>
+              <w:bottom w:val="single" w:color="D8D8CC" w:sz="4"/>
+              <w:right w:val="single" w:color="D8D8CC" w:sz="4"/>
+            </w:tcBorders>
+            <w:shd w:fill="3A3A3A" w:color="auto" w:val="clear"/>
+          </w:tcPr>
+          <w:p>
+            <w:pPr>
+              <w:spacing w:after="0" w:before="0" w:line="276"/>
+            </w:pPr>
+            <w:r>
+              <w:rPr>
+                <w:rFonts w:ascii="Calibri" w:cs="Calibri" w:eastAsia="Calibri" w:hAnsi="Calibri"/>
+                <w:color w:val="55554A"/>
+                <w:sz w:val="20"/>
+                <w:szCs w:val="20"/>
+              </w:rPr>
+              <w:t xml:space="preserve"/>
+            </w:r>
+          </w:p>
+          <w:p>
+            <w:pPr>
+              <w:spacing w:after="0" w:before="0" w:line="276"/>
+            </w:pPr>
+            <w:r>
+              <w:rPr>
+                <w:rFonts w:ascii="Calibri" w:cs="Calibri" w:eastAsia="Calibri" w:hAnsi="Calibri"/>
+                <w:color w:val="55554A"/>
+                <w:sz w:val="20"/>
+                <w:szCs w:val="20"/>
+              </w:rPr>
+              <w:t xml:space="preserve"/>
+            </w:r>
+          </w:p>
+        </w:tc>
+        <w:tc>
+          <w:tcPr>
+            <w:tcW w:type="dxa" w:w="5860"/>
+            <w:tcBorders>
+              <w:top w:val="single" w:color="D8D8CC" w:sz="4"/>
+              <w:left w:val="none" w:color="FFFFFF" w:sz="0"/>
+              <w:bottom w:val="single" w:color="D8D8CC" w:sz="4"/>
+              <w:right w:val="none" w:color="FFFFFF" w:sz="0"/>
+            </w:tcBorders>
+            <w:tcMar>
+              <w:top w:type="dxa" w:w="120"/>
+              <w:left w:type="dxa" w:w="200"/>
+              <w:bottom w:type="dxa" w:w="120"/>
+              <w:right w:type="dxa" w:w="160"/>
+            </w:tcMar>
+          </w:tcPr>
+          <w:p>
+            <w:pPr>
+              <w:spacing w:after="40" w:before="0" w:line="276"/>
+            </w:pPr>
+            <w:r>
+              <w:rPr>
+                <w:rFonts w:ascii="Calibri" w:cs="Calibri" w:eastAsia="Calibri" w:hAnsi="Calibri"/>
+                <w:b/>
+                <w:bCs/>
+                <w:color w:val="1A1A14"/>
+                <w:sz w:val="21"/>
+                <w:szCs w:val="21"/>
+              </w:rPr>
+              <w:t xml:space="preserve">--border</w:t>
+            </w:r>
+          </w:p>
+          <w:p>
+            <w:pPr>
+              <w:spacing w:after="0" w:before="0" w:line="276"/>
+            </w:pPr>
+            <w:r>
+              <w:rPr>
+                <w:rFonts w:ascii="Calibri" w:cs="Calibri" w:eastAsia="Calibri" w:hAnsi="Calibri"/>
+                <w:color w:val="55554A"/>
+                <w:sz w:val="18"/>
+                <w:szCs w:val="18"/>
+              </w:rPr>
+              <w:t xml:space="preserve">Bordi e separatori pieni. Per i bordi leggeri l’app usa rgba(255,255,255,.08–.12).</w:t>
+            </w:r>
+          </w:p>
+        </w:tc>
+        <w:tc>
+          <w:tcPr>
+            <w:tcW w:type="dxa" w:w="2600"/>
+            <w:tcBorders>
+              <w:top w:val="single" w:color="D8D8CC" w:sz="4"/>
+              <w:left w:val="single" w:color="D8D8CC" w:sz="4"/>
+              <w:bottom w:val="single" w:color="D8D8CC" w:sz="4"/>
+              <w:right w:val="single" w:color="D8D8CC" w:sz="4"/>
+            </w:tcBorders>
+            <w:shd w:fill="FAFAF6" w:color="auto" w:val="clear"/>
+            <w:tcMar>
+              <w:top w:type="dxa" w:w="120"/>
+              <w:left w:type="dxa" w:w="160"/>
+              <w:bottom w:type="dxa" w:w="120"/>
+              <w:right w:type="dxa" w:w="160"/>
+            </w:tcMar>
+          </w:tcPr>
+          <w:p>
+            <w:pPr>
+              <w:spacing w:after="30" w:before="0" w:line="276"/>
+              <w:jc w:val="right"/>
+            </w:pPr>
+            <w:r>
+              <w:rPr>
+                <w:rFonts w:ascii="Consolas" w:cs="Consolas" w:eastAsia="Consolas" w:hAnsi="Consolas"/>
+                <w:color w:val="1A1A14"/>
+                <w:sz w:val="20"/>
+                <w:szCs w:val="20"/>
+              </w:rPr>
+              <w:t xml:space="preserve">#3A3A3A</w:t>
+            </w:r>
+          </w:p>
+          <w:p>
+            <w:pPr>
+              <w:spacing w:after="0" w:before="0" w:line="276"/>
+              <w:jc w:val="right"/>
+            </w:pPr>
+            <w:r>
+              <w:rPr>
+                <w:rFonts w:ascii="Consolas" w:cs="Consolas" w:eastAsia="Consolas" w:hAnsi="Consolas"/>
+                <w:color w:val="8A8A78"/>
+                <w:sz w:val="15"/>
+                <w:szCs w:val="15"/>
+              </w:rPr>
+              <w:t xml:space="preserve">oklch(38% 0 0)</w:t>
             </w:r>
           </w:p>
         </w:tc>
@@ -3689,7 +3963,7 @@
               <w:bottom w:val="single" w:color="D8D8CC" w:sz="4"/>
               <w:right w:val="single" w:color="D8D8CC" w:sz="4"/>
             </w:tcBorders>
-            <w:shd w:fill="F5F5EF" w:color="auto" w:val="clear"/>
+            <w:shd w:fill="FFFFFF" w:color="auto" w:val="clear"/>
           </w:tcPr>
           <w:p>
             <w:pPr>
@@ -3749,7 +4023,7 @@
                 <w:sz w:val="21"/>
                 <w:szCs w:val="21"/>
               </w:rPr>
-              <w:t xml:space="preserve">WHITE</w:t>
+              <w:t xml:space="preserve">--text</w:t>
             </w:r>
           </w:p>
           <w:p>
@@ -3763,7 +4037,7 @@
                 <w:sz w:val="18"/>
                 <w:szCs w:val="18"/>
               </w:rPr>
-              <w:t xml:space="preserve">Titoli e testo principale. Un bianco appena sporco: il bianco puro su nero pieno abbaglia.</w:t>
+              <w:t xml:space="preserve">Titoli e testo principale. Bianco pieno.</w:t>
             </w:r>
           </w:p>
         </w:tc>
@@ -3796,7 +4070,7 @@
                 <w:sz w:val="20"/>
                 <w:szCs w:val="20"/>
               </w:rPr>
-              <w:t xml:space="preserve">#F5F5EF</w:t>
+              <w:t xml:space="preserve">#FFFFFF</w:t>
             </w:r>
           </w:p>
           <w:p>
@@ -3811,7 +4085,7 @@
                 <w:sz w:val="15"/>
                 <w:szCs w:val="15"/>
               </w:rPr>
-              <w:t xml:space="preserve">oklch(96% .01 89)</w:t>
+              <w:t xml:space="preserve">opacita’ 100%</w:t>
             </w:r>
           </w:p>
         </w:tc>
@@ -3826,7 +4100,7 @@
               <w:bottom w:val="single" w:color="D8D8CC" w:sz="4"/>
               <w:right w:val="single" w:color="D8D8CC" w:sz="4"/>
             </w:tcBorders>
-            <w:shd w:fill="C4C4A8" w:color="auto" w:val="clear"/>
+            <w:shd w:fill="9A9A9A" w:color="auto" w:val="clear"/>
           </w:tcPr>
           <w:p>
             <w:pPr>
@@ -3886,7 +4160,7 @@
                 <w:sz w:val="21"/>
                 <w:szCs w:val="21"/>
               </w:rPr>
-              <w:t xml:space="preserve">GRAY 300</w:t>
+              <w:t xml:space="preserve">--text-sub</w:t>
             </w:r>
           </w:p>
           <w:p>
@@ -3900,7 +4174,7 @@
                 <w:sz w:val="18"/>
                 <w:szCs w:val="18"/>
               </w:rPr>
-              <w:t xml:space="preserve">Testo secondario: descrizioni, sottotitoli, orari, dettagli sotto un titolo.</w:t>
+              <w:t xml:space="preserve">Testo secondario: descrizioni, sottotitoli, orari. E’ bianco al 60%, non un grigio fisso: prende il fondo che ha sotto.</w:t>
             </w:r>
           </w:p>
         </w:tc>
@@ -3933,7 +4207,7 @@
                 <w:sz w:val="20"/>
                 <w:szCs w:val="20"/>
               </w:rPr>
-              <w:t xml:space="preserve">#C4C4A8</w:t>
+              <w:t xml:space="preserve">#9A9A9A</w:t>
             </w:r>
           </w:p>
           <w:p>
@@ -3948,7 +4222,7 @@
                 <w:sz w:val="15"/>
                 <w:szCs w:val="15"/>
               </w:rPr>
-              <w:t xml:space="preserve">oklch(79% .03 89)</w:t>
+              <w:t xml:space="preserve">rgba(255,255,255,.60)</w:t>
             </w:r>
           </w:p>
         </w:tc>
@@ -3963,7 +4237,7 @@
               <w:bottom w:val="single" w:color="D8D8CC" w:sz="4"/>
               <w:right w:val="single" w:color="D8D8CC" w:sz="4"/>
             </w:tcBorders>
-            <w:shd w:fill="7A7A60" w:color="auto" w:val="clear"/>
+            <w:shd w:fill="636363" w:color="auto" w:val="clear"/>
           </w:tcPr>
           <w:p>
             <w:pPr>
@@ -4023,7 +4297,7 @@
                 <w:sz w:val="21"/>
                 <w:szCs w:val="21"/>
               </w:rPr>
-              <w:t xml:space="preserve">GRAY 500</w:t>
+              <w:t xml:space="preserve">--text-muted</w:t>
             </w:r>
           </w:p>
           <w:p>
@@ -4037,7 +4311,7 @@
                 <w:sz w:val="18"/>
                 <w:szCs w:val="18"/>
               </w:rPr>
-              <w:t xml:space="preserve">Terzo livello: placeholder, etichette piccole, note. Solo per testo di almeno 18 px.</w:t>
+              <w:t xml:space="preserve">Terzo livello: placeholder, etichette piccole, note. Bianco al 35%. Solo per testo grande.</w:t>
             </w:r>
           </w:p>
         </w:tc>
@@ -4070,7 +4344,7 @@
                 <w:sz w:val="20"/>
                 <w:szCs w:val="20"/>
               </w:rPr>
-              <w:t xml:space="preserve">#7A7A60</w:t>
+              <w:t xml:space="preserve">#636363</w:t>
             </w:r>
           </w:p>
           <w:p>
@@ -4085,7 +4359,7 @@
                 <w:sz w:val="15"/>
                 <w:szCs w:val="15"/>
               </w:rPr>
-              <w:t xml:space="preserve">oklch(52% .03 89)</w:t>
+              <w:t xml:space="preserve">rgba(255,255,255,.35)</w:t>
             </w:r>
           </w:p>
         </w:tc>
@@ -4188,7 +4462,7 @@
               <w:bottom w:val="single" w:color="D8D8CC" w:sz="4"/>
               <w:right w:val="single" w:color="D8D8CC" w:sz="4"/>
             </w:tcBorders>
-            <w:shd w:fill="22C55E" w:color="auto" w:val="clear"/>
+            <w:shd w:fill="4CD964" w:color="auto" w:val="clear"/>
           </w:tcPr>
           <w:p>
             <w:pPr>
@@ -4248,7 +4522,7 @@
                 <w:sz w:val="21"/>
                 <w:szCs w:val="21"/>
               </w:rPr>
-              <w:t xml:space="preserve">SUCCESS</w:t>
+              <w:t xml:space="preserve">--success</w:t>
             </w:r>
           </w:p>
           <w:p>
@@ -4262,7 +4536,7 @@
                 <w:sz w:val="18"/>
                 <w:szCs w:val="18"/>
               </w:rPr>
-              <w:t xml:space="preserve">Pagamento riuscito, prenotazione confermata, ordine completato.</w:t>
+              <w:t xml:space="preserve">Pagamento riuscito, prenotazione confermata, tavolo libero sulla mappa. E’ il verde di sistema di iOS: convenzionale per scelta, non per caso.</w:t>
             </w:r>
           </w:p>
         </w:tc>
@@ -4295,7 +4569,7 @@
                 <w:sz w:val="20"/>
                 <w:szCs w:val="20"/>
               </w:rPr>
-              <w:t xml:space="preserve">#22C55E</w:t>
+              <w:t xml:space="preserve">#4CD964</w:t>
             </w:r>
           </w:p>
           <w:p>
@@ -4310,7 +4584,144 @@
                 <w:sz w:val="15"/>
                 <w:szCs w:val="15"/>
               </w:rPr>
-              <w:t xml:space="preserve">oklch(72% .19 149)</w:t>
+              <w:t xml:space="preserve">oklch(78% .19 148)</w:t>
+            </w:r>
+          </w:p>
+        </w:tc>
+      </w:tr>
+      <w:tr>
+        <w:tc>
+          <w:tcPr>
+            <w:tcW w:type="dxa" w:w="900"/>
+            <w:tcBorders>
+              <w:top w:val="single" w:color="D8D8CC" w:sz="4"/>
+              <w:left w:val="single" w:color="D8D8CC" w:sz="4"/>
+              <w:bottom w:val="single" w:color="D8D8CC" w:sz="4"/>
+              <w:right w:val="single" w:color="D8D8CC" w:sz="4"/>
+            </w:tcBorders>
+            <w:shd w:fill="1A3D1A" w:color="auto" w:val="clear"/>
+          </w:tcPr>
+          <w:p>
+            <w:pPr>
+              <w:spacing w:after="0" w:before="0" w:line="276"/>
+            </w:pPr>
+            <w:r>
+              <w:rPr>
+                <w:rFonts w:ascii="Calibri" w:cs="Calibri" w:eastAsia="Calibri" w:hAnsi="Calibri"/>
+                <w:color w:val="55554A"/>
+                <w:sz w:val="20"/>
+                <w:szCs w:val="20"/>
+              </w:rPr>
+              <w:t xml:space="preserve"/>
+            </w:r>
+          </w:p>
+          <w:p>
+            <w:pPr>
+              <w:spacing w:after="0" w:before="0" w:line="276"/>
+            </w:pPr>
+            <w:r>
+              <w:rPr>
+                <w:rFonts w:ascii="Calibri" w:cs="Calibri" w:eastAsia="Calibri" w:hAnsi="Calibri"/>
+                <w:color w:val="55554A"/>
+                <w:sz w:val="20"/>
+                <w:szCs w:val="20"/>
+              </w:rPr>
+              <w:t xml:space="preserve"/>
+            </w:r>
+          </w:p>
+        </w:tc>
+        <w:tc>
+          <w:tcPr>
+            <w:tcW w:type="dxa" w:w="5860"/>
+            <w:tcBorders>
+              <w:top w:val="single" w:color="D8D8CC" w:sz="4"/>
+              <w:left w:val="none" w:color="FFFFFF" w:sz="0"/>
+              <w:bottom w:val="single" w:color="D8D8CC" w:sz="4"/>
+              <w:right w:val="none" w:color="FFFFFF" w:sz="0"/>
+            </w:tcBorders>
+            <w:tcMar>
+              <w:top w:type="dxa" w:w="120"/>
+              <w:left w:type="dxa" w:w="200"/>
+              <w:bottom w:type="dxa" w:w="120"/>
+              <w:right w:type="dxa" w:w="160"/>
+            </w:tcMar>
+          </w:tcPr>
+          <w:p>
+            <w:pPr>
+              <w:spacing w:after="40" w:before="0" w:line="276"/>
+            </w:pPr>
+            <w:r>
+              <w:rPr>
+                <w:rFonts w:ascii="Calibri" w:cs="Calibri" w:eastAsia="Calibri" w:hAnsi="Calibri"/>
+                <w:b/>
+                <w:bCs/>
+                <w:color w:val="1A1A14"/>
+                <w:sz w:val="21"/>
+                <w:szCs w:val="21"/>
+              </w:rPr>
+              <w:t xml:space="preserve">--success-dim</w:t>
+            </w:r>
+          </w:p>
+          <w:p>
+            <w:pPr>
+              <w:spacing w:after="0" w:before="0" w:line="276"/>
+            </w:pPr>
+            <w:r>
+              <w:rPr>
+                <w:rFonts w:ascii="Calibri" w:cs="Calibri" w:eastAsia="Calibri" w:hAnsi="Calibri"/>
+                <w:color w:val="55554A"/>
+                <w:sz w:val="18"/>
+                <w:szCs w:val="18"/>
+              </w:rPr>
+              <w:t xml:space="preserve">Il verde spento: fondo dei tavoli selezionabili, righe confermate.</w:t>
+            </w:r>
+          </w:p>
+        </w:tc>
+        <w:tc>
+          <w:tcPr>
+            <w:tcW w:type="dxa" w:w="2600"/>
+            <w:tcBorders>
+              <w:top w:val="single" w:color="D8D8CC" w:sz="4"/>
+              <w:left w:val="single" w:color="D8D8CC" w:sz="4"/>
+              <w:bottom w:val="single" w:color="D8D8CC" w:sz="4"/>
+              <w:right w:val="single" w:color="D8D8CC" w:sz="4"/>
+            </w:tcBorders>
+            <w:shd w:fill="FAFAF6" w:color="auto" w:val="clear"/>
+            <w:tcMar>
+              <w:top w:type="dxa" w:w="120"/>
+              <w:left w:type="dxa" w:w="160"/>
+              <w:bottom w:type="dxa" w:w="120"/>
+              <w:right w:type="dxa" w:w="160"/>
+            </w:tcMar>
+          </w:tcPr>
+          <w:p>
+            <w:pPr>
+              <w:spacing w:after="30" w:before="0" w:line="276"/>
+              <w:jc w:val="right"/>
+            </w:pPr>
+            <w:r>
+              <w:rPr>
+                <w:rFonts w:ascii="Consolas" w:cs="Consolas" w:eastAsia="Consolas" w:hAnsi="Consolas"/>
+                <w:color w:val="1A1A14"/>
+                <w:sz w:val="20"/>
+                <w:szCs w:val="20"/>
+              </w:rPr>
+              <w:t xml:space="preserve">#1A3D1A</w:t>
+            </w:r>
+          </w:p>
+          <w:p>
+            <w:pPr>
+              <w:spacing w:after="0" w:before="0" w:line="276"/>
+              <w:jc w:val="right"/>
+            </w:pPr>
+            <w:r>
+              <w:rPr>
+                <w:rFonts w:ascii="Consolas" w:cs="Consolas" w:eastAsia="Consolas" w:hAnsi="Consolas"/>
+                <w:color w:val="8A8A78"/>
+                <w:sz w:val="15"/>
+                <w:szCs w:val="15"/>
+              </w:rPr>
+              <w:t xml:space="preserve">oklch(31% .08 148)</w:t>
             </w:r>
           </w:p>
         </w:tc>
@@ -4385,7 +4796,7 @@
                 <w:sz w:val="21"/>
                 <w:szCs w:val="21"/>
               </w:rPr>
-              <w:t xml:space="preserve">ERROR</w:t>
+              <w:t xml:space="preserve">--error</w:t>
             </w:r>
           </w:p>
           <w:p>
@@ -4399,7 +4810,7 @@
                 <w:sz w:val="18"/>
                 <w:szCs w:val="18"/>
               </w:rPr>
-              <w:t xml:space="preserve">Errori di campo, pagamento rifiutato, azioni distruttive.</w:t>
+              <w:t xml:space="preserve">Errori di campo, pagamento rifiutato, azioni distruttive. Pieni e bordi.</w:t>
             </w:r>
           </w:p>
         </w:tc>
@@ -4462,7 +4873,7 @@
               <w:bottom w:val="single" w:color="D8D8CC" w:sz="4"/>
               <w:right w:val="single" w:color="D8D8CC" w:sz="4"/>
             </w:tcBorders>
-            <w:shd w:fill="FF4040" w:color="auto" w:val="clear"/>
+            <w:shd w:fill="FF6B61" w:color="auto" w:val="clear"/>
           </w:tcPr>
           <w:p>
             <w:pPr>
@@ -4522,7 +4933,7 @@
                 <w:sz w:val="21"/>
                 <w:szCs w:val="21"/>
               </w:rPr>
-              <w:t xml:space="preserve">LIVE</w:t>
+              <w:t xml:space="preserve">--error-soft</w:t>
             </w:r>
           </w:p>
           <w:p>
@@ -4536,7 +4947,7 @@
                 <w:sz w:val="18"/>
                 <w:szCs w:val="18"/>
               </w:rPr>
-              <w:t xml:space="preserve">Solo per il badge LIVE durante le dirette. È anche il colore che dà corpo alla seconda lettura del nome — quando è acceso, CAM è davvero ON.</w:t>
+              <w:t xml:space="preserve">Il rosso quando e’ TESTO su fondo scuro: 6.7:1 invece di 5.0:1.</w:t>
             </w:r>
           </w:p>
         </w:tc>
@@ -4569,7 +4980,7 @@
                 <w:sz w:val="20"/>
                 <w:szCs w:val="20"/>
               </w:rPr>
-              <w:t xml:space="preserve">#FF4040</w:t>
+              <w:t xml:space="preserve">#FF6B61</w:t>
             </w:r>
           </w:p>
           <w:p>
@@ -4584,7 +4995,7 @@
                 <w:sz w:val="15"/>
                 <w:szCs w:val="15"/>
               </w:rPr>
-              <w:t xml:space="preserve">oklch(66% .22 27)</w:t>
+              <w:t xml:space="preserve">oklch(70% .16 26)</w:t>
             </w:r>
           </w:p>
         </w:tc>
@@ -4599,7 +5010,7 @@
               <w:bottom w:val="single" w:color="D8D8CC" w:sz="4"/>
               <w:right w:val="single" w:color="D8D8CC" w:sz="4"/>
             </w:tcBorders>
-            <w:shd w:fill="38BDF8" w:color="auto" w:val="clear"/>
+            <w:shd w:fill="FF4040" w:color="auto" w:val="clear"/>
           </w:tcPr>
           <w:p>
             <w:pPr>
@@ -4659,7 +5070,7 @@
                 <w:sz w:val="21"/>
                 <w:szCs w:val="21"/>
               </w:rPr>
-              <w:t xml:space="preserve">INFO</w:t>
+              <w:t xml:space="preserve">--live</w:t>
             </w:r>
           </w:p>
           <w:p>
@@ -4673,7 +5084,7 @@
                 <w:sz w:val="18"/>
                 <w:szCs w:val="18"/>
               </w:rPr>
-              <w:t xml:space="preserve">Avvisi neutri, tooltip, banner informativi che non richiedono azione.</w:t>
+              <w:t xml:space="preserve">Solo per il badge LIVE durante le dirette. È anche il colore che dà corpo alla seconda lettura del nome — quando è acceso, CAM è davvero ON.</w:t>
             </w:r>
           </w:p>
         </w:tc>
@@ -4706,7 +5117,7 @@
                 <w:sz w:val="20"/>
                 <w:szCs w:val="20"/>
               </w:rPr>
-              <w:t xml:space="preserve">#38BDF8</w:t>
+              <w:t xml:space="preserve">#FF4040</w:t>
             </w:r>
           </w:p>
           <w:p>
@@ -4721,7 +5132,144 @@
                 <w:sz w:val="15"/>
                 <w:szCs w:val="15"/>
               </w:rPr>
-              <w:t xml:space="preserve">oklch(75% .13 233)</w:t>
+              <w:t xml:space="preserve">oklch(66% .22 27)</w:t>
+            </w:r>
+          </w:p>
+        </w:tc>
+      </w:tr>
+      <w:tr>
+        <w:tc>
+          <w:tcPr>
+            <w:tcW w:type="dxa" w:w="900"/>
+            <w:tcBorders>
+              <w:top w:val="single" w:color="D8D8CC" w:sz="4"/>
+              <w:left w:val="single" w:color="D8D8CC" w:sz="4"/>
+              <w:bottom w:val="single" w:color="D8D8CC" w:sz="4"/>
+              <w:right w:val="single" w:color="D8D8CC" w:sz="4"/>
+            </w:tcBorders>
+            <w:shd w:fill="64C8FF" w:color="auto" w:val="clear"/>
+          </w:tcPr>
+          <w:p>
+            <w:pPr>
+              <w:spacing w:after="0" w:before="0" w:line="276"/>
+            </w:pPr>
+            <w:r>
+              <w:rPr>
+                <w:rFonts w:ascii="Calibri" w:cs="Calibri" w:eastAsia="Calibri" w:hAnsi="Calibri"/>
+                <w:color w:val="55554A"/>
+                <w:sz w:val="20"/>
+                <w:szCs w:val="20"/>
+              </w:rPr>
+              <w:t xml:space="preserve"/>
+            </w:r>
+          </w:p>
+          <w:p>
+            <w:pPr>
+              <w:spacing w:after="0" w:before="0" w:line="276"/>
+            </w:pPr>
+            <w:r>
+              <w:rPr>
+                <w:rFonts w:ascii="Calibri" w:cs="Calibri" w:eastAsia="Calibri" w:hAnsi="Calibri"/>
+                <w:color w:val="55554A"/>
+                <w:sz w:val="20"/>
+                <w:szCs w:val="20"/>
+              </w:rPr>
+              <w:t xml:space="preserve"/>
+            </w:r>
+          </w:p>
+        </w:tc>
+        <w:tc>
+          <w:tcPr>
+            <w:tcW w:type="dxa" w:w="5860"/>
+            <w:tcBorders>
+              <w:top w:val="single" w:color="D8D8CC" w:sz="4"/>
+              <w:left w:val="none" w:color="FFFFFF" w:sz="0"/>
+              <w:bottom w:val="single" w:color="D8D8CC" w:sz="4"/>
+              <w:right w:val="none" w:color="FFFFFF" w:sz="0"/>
+            </w:tcBorders>
+            <w:tcMar>
+              <w:top w:type="dxa" w:w="120"/>
+              <w:left w:type="dxa" w:w="200"/>
+              <w:bottom w:type="dxa" w:w="120"/>
+              <w:right w:type="dxa" w:w="160"/>
+            </w:tcMar>
+          </w:tcPr>
+          <w:p>
+            <w:pPr>
+              <w:spacing w:after="40" w:before="0" w:line="276"/>
+            </w:pPr>
+            <w:r>
+              <w:rPr>
+                <w:rFonts w:ascii="Calibri" w:cs="Calibri" w:eastAsia="Calibri" w:hAnsi="Calibri"/>
+                <w:b/>
+                <w:bCs/>
+                <w:color w:val="1A1A14"/>
+                <w:sz w:val="21"/>
+                <w:szCs w:val="21"/>
+              </w:rPr>
+              <w:t xml:space="preserve">--info</w:t>
+            </w:r>
+          </w:p>
+          <w:p>
+            <w:pPr>
+              <w:spacing w:after="0" w:before="0" w:line="276"/>
+            </w:pPr>
+            <w:r>
+              <w:rPr>
+                <w:rFonts w:ascii="Calibri" w:cs="Calibri" w:eastAsia="Calibri" w:hAnsi="Calibri"/>
+                <w:color w:val="55554A"/>
+                <w:sz w:val="18"/>
+                <w:szCs w:val="18"/>
+              </w:rPr>
+              <w:t xml:space="preserve">Avvisi neutri, tooltip, banner informativi che non richiedono azione.</w:t>
+            </w:r>
+          </w:p>
+        </w:tc>
+        <w:tc>
+          <w:tcPr>
+            <w:tcW w:type="dxa" w:w="2600"/>
+            <w:tcBorders>
+              <w:top w:val="single" w:color="D8D8CC" w:sz="4"/>
+              <w:left w:val="single" w:color="D8D8CC" w:sz="4"/>
+              <w:bottom w:val="single" w:color="D8D8CC" w:sz="4"/>
+              <w:right w:val="single" w:color="D8D8CC" w:sz="4"/>
+            </w:tcBorders>
+            <w:shd w:fill="FAFAF6" w:color="auto" w:val="clear"/>
+            <w:tcMar>
+              <w:top w:type="dxa" w:w="120"/>
+              <w:left w:type="dxa" w:w="160"/>
+              <w:bottom w:type="dxa" w:w="120"/>
+              <w:right w:type="dxa" w:w="160"/>
+            </w:tcMar>
+          </w:tcPr>
+          <w:p>
+            <w:pPr>
+              <w:spacing w:after="30" w:before="0" w:line="276"/>
+              <w:jc w:val="right"/>
+            </w:pPr>
+            <w:r>
+              <w:rPr>
+                <w:rFonts w:ascii="Consolas" w:cs="Consolas" w:eastAsia="Consolas" w:hAnsi="Consolas"/>
+                <w:color w:val="1A1A14"/>
+                <w:sz w:val="20"/>
+                <w:szCs w:val="20"/>
+              </w:rPr>
+              <w:t xml:space="preserve">#64C8FF</w:t>
+            </w:r>
+          </w:p>
+          <w:p>
+            <w:pPr>
+              <w:spacing w:after="0" w:before="0" w:line="276"/>
+              <w:jc w:val="right"/>
+            </w:pPr>
+            <w:r>
+              <w:rPr>
+                <w:rFonts w:ascii="Consolas" w:cs="Consolas" w:eastAsia="Consolas" w:hAnsi="Consolas"/>
+                <w:color w:val="8A8A78"/>
+                <w:sz w:val="15"/>
+                <w:szCs w:val="15"/>
+              </w:rPr>
+              <w:t xml:space="preserve">oklch(79% .11 233)</w:t>
             </w:r>
           </w:p>
         </w:tc>
@@ -4790,7 +5338,7 @@
                 <w:sz w:val="20"/>
                 <w:szCs w:val="20"/>
               </w:rPr>
-              <w:t xml:space="preserve">In molte interfacce il giallo significa “attenzione”: qui no, perché è il brand. Se serve un avviso si usa #EF4444 o #38BDF8 — mai il giallo, o l’utente non capisce se è un allarme o un bottone.</w:t>
+              <w:t xml:space="preserve">In molte interfacce il giallo significa “attenzione”: qui no, perché è il brand. Se serve un avviso si usa #EF4444 o #64C8FF — mai il giallo, o l’utente non capisce se è un allarme o un bottone.</w:t>
             </w:r>
           </w:p>
         </w:tc>
@@ -5171,7 +5719,7 @@
                 <w:sz w:val="18"/>
                 <w:szCs w:val="18"/>
               </w:rPr>
-              <w:t xml:space="preserve">White #F5F5EF</w:t>
+              <w:t xml:space="preserve">--text · bianco</w:t>
             </w:r>
           </w:p>
         </w:tc>
@@ -5198,7 +5746,7 @@
                 <w:sz w:val="18"/>
                 <w:szCs w:val="18"/>
               </w:rPr>
-              <w:t xml:space="preserve">Dark 950 #0D0D0B</w:t>
+              <w:t xml:space="preserve">--bg #111111</w:t>
             </w:r>
           </w:p>
         </w:tc>
@@ -5225,7 +5773,7 @@
                 <w:sz w:val="18"/>
                 <w:szCs w:val="18"/>
               </w:rPr>
-              <w:t xml:space="preserve">17.6:1</w:t>
+              <w:t xml:space="preserve">18.9:1</w:t>
             </w:r>
           </w:p>
         </w:tc>
@@ -5281,7 +5829,7 @@
                 <w:sz w:val="18"/>
                 <w:szCs w:val="18"/>
               </w:rPr>
-              <w:t xml:space="preserve">Yellow #F7CC49</w:t>
+              <w:t xml:space="preserve">--brand #F7CC49</w:t>
             </w:r>
           </w:p>
         </w:tc>
@@ -5308,7 +5856,7 @@
                 <w:sz w:val="18"/>
                 <w:szCs w:val="18"/>
               </w:rPr>
-              <w:t xml:space="preserve">Dark 950 #0D0D0B</w:t>
+              <w:t xml:space="preserve">--bg #111111</w:t>
             </w:r>
           </w:p>
         </w:tc>
@@ -5335,7 +5883,7 @@
                 <w:sz w:val="18"/>
                 <w:szCs w:val="18"/>
               </w:rPr>
-              <w:t xml:space="preserve">12.7:1</w:t>
+              <w:t xml:space="preserve">12.3:1</w:t>
             </w:r>
           </w:p>
         </w:tc>
@@ -5391,7 +5939,7 @@
                 <w:sz w:val="18"/>
                 <w:szCs w:val="18"/>
               </w:rPr>
-              <w:t xml:space="preserve">Gray 300 #C4C4A8</w:t>
+              <w:t xml:space="preserve">--on-brand #111111</w:t>
             </w:r>
           </w:p>
         </w:tc>
@@ -5418,7 +5966,7 @@
                 <w:sz w:val="18"/>
                 <w:szCs w:val="18"/>
               </w:rPr>
-              <w:t xml:space="preserve">Dark 950 #0D0D0B</w:t>
+              <w:t xml:space="preserve">--brand #F7CC49</w:t>
             </w:r>
           </w:p>
         </w:tc>
@@ -5445,7 +5993,7 @@
                 <w:sz w:val="18"/>
                 <w:szCs w:val="18"/>
               </w:rPr>
-              <w:t xml:space="preserve">10.8:1</w:t>
+              <w:t xml:space="preserve">12.3:1</w:t>
             </w:r>
           </w:p>
         </w:tc>
@@ -5501,7 +6049,7 @@
                 <w:sz w:val="18"/>
                 <w:szCs w:val="18"/>
               </w:rPr>
-              <w:t xml:space="preserve">Black #222221</w:t>
+              <w:t xml:space="preserve">--success #4CD964</w:t>
             </w:r>
           </w:p>
         </w:tc>
@@ -5528,7 +6076,7 @@
                 <w:sz w:val="18"/>
                 <w:szCs w:val="18"/>
               </w:rPr>
-              <w:t xml:space="preserve">Yellow #F7CC49</w:t>
+              <w:t xml:space="preserve">--bg #111111</w:t>
             </w:r>
           </w:p>
         </w:tc>
@@ -5555,7 +6103,7 @@
                 <w:sz w:val="18"/>
                 <w:szCs w:val="18"/>
               </w:rPr>
-              <w:t xml:space="preserve">10.4:1</w:t>
+              <w:t xml:space="preserve">10.3:1</w:t>
             </w:r>
           </w:p>
         </w:tc>
@@ -5611,7 +6159,7 @@
                 <w:sz w:val="18"/>
                 <w:szCs w:val="18"/>
               </w:rPr>
-              <w:t xml:space="preserve">Gray 500 #7A7A60</w:t>
+              <w:t xml:space="preserve">--text-sub · bianco 60%</w:t>
             </w:r>
           </w:p>
         </w:tc>
@@ -5638,7 +6186,7 @@
                 <w:sz w:val="18"/>
                 <w:szCs w:val="18"/>
               </w:rPr>
-              <w:t xml:space="preserve">Dark 950 #0D0D0B</w:t>
+              <w:t xml:space="preserve">--bg #111111</w:t>
             </w:r>
           </w:p>
         </w:tc>
@@ -5665,7 +6213,337 @@
                 <w:sz w:val="18"/>
                 <w:szCs w:val="18"/>
               </w:rPr>
-              <w:t xml:space="preserve">4.4:1</w:t>
+              <w:t xml:space="preserve">7.2:1</w:t>
+            </w:r>
+          </w:p>
+        </w:tc>
+        <w:tc>
+          <w:tcPr>
+            <w:tcW w:type="dxa" w:w="2260"/>
+            <w:tcMar>
+              <w:top w:type="dxa" w:w="90"/>
+              <w:left w:type="dxa" w:w="140"/>
+              <w:bottom w:type="dxa" w:w="90"/>
+              <w:right w:type="dxa" w:w="140"/>
+            </w:tcMar>
+          </w:tcPr>
+          <w:p>
+            <w:pPr>
+              <w:spacing w:after="0" w:before="0" w:line="276"/>
+            </w:pPr>
+            <w:r>
+              <w:rPr>
+                <w:rFonts w:ascii="Calibri" w:cs="Calibri" w:eastAsia="Calibri" w:hAnsi="Calibri"/>
+                <w:b/>
+                <w:bCs/>
+                <w:color w:val="1B7F3D"/>
+                <w:sz w:val="18"/>
+                <w:szCs w:val="18"/>
+              </w:rPr>
+              <w:t xml:space="preserve">AAA</w:t>
+            </w:r>
+          </w:p>
+        </w:tc>
+      </w:tr>
+      <w:tr>
+        <w:tc>
+          <w:tcPr>
+            <w:tcW w:type="dxa" w:w="2700"/>
+            <w:tcMar>
+              <w:top w:type="dxa" w:w="90"/>
+              <w:left w:type="dxa" w:w="140"/>
+              <w:bottom w:type="dxa" w:w="90"/>
+              <w:right w:type="dxa" w:w="140"/>
+            </w:tcMar>
+          </w:tcPr>
+          <w:p>
+            <w:pPr>
+              <w:spacing w:after="0" w:before="0" w:line="276"/>
+            </w:pPr>
+            <w:r>
+              <w:rPr>
+                <w:rFonts w:ascii="Calibri" w:cs="Calibri" w:eastAsia="Calibri" w:hAnsi="Calibri"/>
+                <w:b w:val="false"/>
+                <w:bCs w:val="false"/>
+                <w:color w:val="55554A"/>
+                <w:sz w:val="18"/>
+                <w:szCs w:val="18"/>
+              </w:rPr>
+              <w:t xml:space="preserve">--error-soft #FF6B61</w:t>
+            </w:r>
+          </w:p>
+        </w:tc>
+        <w:tc>
+          <w:tcPr>
+            <w:tcW w:type="dxa" w:w="2700"/>
+            <w:tcMar>
+              <w:top w:type="dxa" w:w="90"/>
+              <w:left w:type="dxa" w:w="140"/>
+              <w:bottom w:type="dxa" w:w="90"/>
+              <w:right w:type="dxa" w:w="140"/>
+            </w:tcMar>
+          </w:tcPr>
+          <w:p>
+            <w:pPr>
+              <w:spacing w:after="0" w:before="0" w:line="276"/>
+            </w:pPr>
+            <w:r>
+              <w:rPr>
+                <w:rFonts w:ascii="Calibri" w:cs="Calibri" w:eastAsia="Calibri" w:hAnsi="Calibri"/>
+                <w:b w:val="false"/>
+                <w:bCs w:val="false"/>
+                <w:color w:val="55554A"/>
+                <w:sz w:val="18"/>
+                <w:szCs w:val="18"/>
+              </w:rPr>
+              <w:t xml:space="preserve">--bg #111111</w:t>
+            </w:r>
+          </w:p>
+        </w:tc>
+        <w:tc>
+          <w:tcPr>
+            <w:tcW w:type="dxa" w:w="1700"/>
+            <w:tcMar>
+              <w:top w:type="dxa" w:w="90"/>
+              <w:left w:type="dxa" w:w="140"/>
+              <w:bottom w:type="dxa" w:w="90"/>
+              <w:right w:type="dxa" w:w="140"/>
+            </w:tcMar>
+          </w:tcPr>
+          <w:p>
+            <w:pPr>
+              <w:spacing w:after="0" w:before="0" w:line="276"/>
+            </w:pPr>
+            <w:r>
+              <w:rPr>
+                <w:rFonts w:ascii="Calibri" w:cs="Calibri" w:eastAsia="Calibri" w:hAnsi="Calibri"/>
+                <w:b/>
+                <w:bCs/>
+                <w:color w:val="1A1A14"/>
+                <w:sz w:val="18"/>
+                <w:szCs w:val="18"/>
+              </w:rPr>
+              <w:t xml:space="preserve">6.7:1</w:t>
+            </w:r>
+          </w:p>
+        </w:tc>
+        <w:tc>
+          <w:tcPr>
+            <w:tcW w:type="dxa" w:w="2260"/>
+            <w:tcMar>
+              <w:top w:type="dxa" w:w="90"/>
+              <w:left w:type="dxa" w:w="140"/>
+              <w:bottom w:type="dxa" w:w="90"/>
+              <w:right w:type="dxa" w:w="140"/>
+            </w:tcMar>
+          </w:tcPr>
+          <w:p>
+            <w:pPr>
+              <w:spacing w:after="0" w:before="0" w:line="276"/>
+            </w:pPr>
+            <w:r>
+              <w:rPr>
+                <w:rFonts w:ascii="Calibri" w:cs="Calibri" w:eastAsia="Calibri" w:hAnsi="Calibri"/>
+                <w:b/>
+                <w:bCs/>
+                <w:color w:val="1B7F3D"/>
+                <w:sz w:val="18"/>
+                <w:szCs w:val="18"/>
+              </w:rPr>
+              <w:t xml:space="preserve">AAA</w:t>
+            </w:r>
+          </w:p>
+        </w:tc>
+      </w:tr>
+      <w:tr>
+        <w:tc>
+          <w:tcPr>
+            <w:tcW w:type="dxa" w:w="2700"/>
+            <w:tcMar>
+              <w:top w:type="dxa" w:w="90"/>
+              <w:left w:type="dxa" w:w="140"/>
+              <w:bottom w:type="dxa" w:w="90"/>
+              <w:right w:type="dxa" w:w="140"/>
+            </w:tcMar>
+          </w:tcPr>
+          <w:p>
+            <w:pPr>
+              <w:spacing w:after="0" w:before="0" w:line="276"/>
+            </w:pPr>
+            <w:r>
+              <w:rPr>
+                <w:rFonts w:ascii="Calibri" w:cs="Calibri" w:eastAsia="Calibri" w:hAnsi="Calibri"/>
+                <w:b w:val="false"/>
+                <w:bCs w:val="false"/>
+                <w:color w:val="55554A"/>
+                <w:sz w:val="18"/>
+                <w:szCs w:val="18"/>
+              </w:rPr>
+              <w:t xml:space="preserve">--error #EF4444</w:t>
+            </w:r>
+          </w:p>
+        </w:tc>
+        <w:tc>
+          <w:tcPr>
+            <w:tcW w:type="dxa" w:w="2700"/>
+            <w:tcMar>
+              <w:top w:type="dxa" w:w="90"/>
+              <w:left w:type="dxa" w:w="140"/>
+              <w:bottom w:type="dxa" w:w="90"/>
+              <w:right w:type="dxa" w:w="140"/>
+            </w:tcMar>
+          </w:tcPr>
+          <w:p>
+            <w:pPr>
+              <w:spacing w:after="0" w:before="0" w:line="276"/>
+            </w:pPr>
+            <w:r>
+              <w:rPr>
+                <w:rFonts w:ascii="Calibri" w:cs="Calibri" w:eastAsia="Calibri" w:hAnsi="Calibri"/>
+                <w:b w:val="false"/>
+                <w:bCs w:val="false"/>
+                <w:color w:val="55554A"/>
+                <w:sz w:val="18"/>
+                <w:szCs w:val="18"/>
+              </w:rPr>
+              <w:t xml:space="preserve">--bg #111111</w:t>
+            </w:r>
+          </w:p>
+        </w:tc>
+        <w:tc>
+          <w:tcPr>
+            <w:tcW w:type="dxa" w:w="1700"/>
+            <w:tcMar>
+              <w:top w:type="dxa" w:w="90"/>
+              <w:left w:type="dxa" w:w="140"/>
+              <w:bottom w:type="dxa" w:w="90"/>
+              <w:right w:type="dxa" w:w="140"/>
+            </w:tcMar>
+          </w:tcPr>
+          <w:p>
+            <w:pPr>
+              <w:spacing w:after="0" w:before="0" w:line="276"/>
+            </w:pPr>
+            <w:r>
+              <w:rPr>
+                <w:rFonts w:ascii="Calibri" w:cs="Calibri" w:eastAsia="Calibri" w:hAnsi="Calibri"/>
+                <w:b/>
+                <w:bCs/>
+                <w:color w:val="1A1A14"/>
+                <w:sz w:val="18"/>
+                <w:szCs w:val="18"/>
+              </w:rPr>
+              <w:t xml:space="preserve">5.0:1</w:t>
+            </w:r>
+          </w:p>
+        </w:tc>
+        <w:tc>
+          <w:tcPr>
+            <w:tcW w:type="dxa" w:w="2260"/>
+            <w:tcMar>
+              <w:top w:type="dxa" w:w="90"/>
+              <w:left w:type="dxa" w:w="140"/>
+              <w:bottom w:type="dxa" w:w="90"/>
+              <w:right w:type="dxa" w:w="140"/>
+            </w:tcMar>
+          </w:tcPr>
+          <w:p>
+            <w:pPr>
+              <w:spacing w:after="0" w:before="0" w:line="276"/>
+            </w:pPr>
+            <w:r>
+              <w:rPr>
+                <w:rFonts w:ascii="Calibri" w:cs="Calibri" w:eastAsia="Calibri" w:hAnsi="Calibri"/>
+                <w:b/>
+                <w:bCs/>
+                <w:color w:val="1B7F3D"/>
+                <w:sz w:val="18"/>
+                <w:szCs w:val="18"/>
+              </w:rPr>
+              <w:t xml:space="preserve">AA</w:t>
+            </w:r>
+          </w:p>
+        </w:tc>
+      </w:tr>
+      <w:tr>
+        <w:tc>
+          <w:tcPr>
+            <w:tcW w:type="dxa" w:w="2700"/>
+            <w:tcMar>
+              <w:top w:type="dxa" w:w="90"/>
+              <w:left w:type="dxa" w:w="140"/>
+              <w:bottom w:type="dxa" w:w="90"/>
+              <w:right w:type="dxa" w:w="140"/>
+            </w:tcMar>
+          </w:tcPr>
+          <w:p>
+            <w:pPr>
+              <w:spacing w:after="0" w:before="0" w:line="276"/>
+            </w:pPr>
+            <w:r>
+              <w:rPr>
+                <w:rFonts w:ascii="Calibri" w:cs="Calibri" w:eastAsia="Calibri" w:hAnsi="Calibri"/>
+                <w:b w:val="false"/>
+                <w:bCs w:val="false"/>
+                <w:color w:val="55554A"/>
+                <w:sz w:val="18"/>
+                <w:szCs w:val="18"/>
+              </w:rPr>
+              <w:t xml:space="preserve">--text-muted · bianco 35%</w:t>
+            </w:r>
+          </w:p>
+        </w:tc>
+        <w:tc>
+          <w:tcPr>
+            <w:tcW w:type="dxa" w:w="2700"/>
+            <w:tcMar>
+              <w:top w:type="dxa" w:w="90"/>
+              <w:left w:type="dxa" w:w="140"/>
+              <w:bottom w:type="dxa" w:w="90"/>
+              <w:right w:type="dxa" w:w="140"/>
+            </w:tcMar>
+          </w:tcPr>
+          <w:p>
+            <w:pPr>
+              <w:spacing w:after="0" w:before="0" w:line="276"/>
+            </w:pPr>
+            <w:r>
+              <w:rPr>
+                <w:rFonts w:ascii="Calibri" w:cs="Calibri" w:eastAsia="Calibri" w:hAnsi="Calibri"/>
+                <w:b w:val="false"/>
+                <w:bCs w:val="false"/>
+                <w:color w:val="55554A"/>
+                <w:sz w:val="18"/>
+                <w:szCs w:val="18"/>
+              </w:rPr>
+              <w:t xml:space="preserve">--bg #111111</w:t>
+            </w:r>
+          </w:p>
+        </w:tc>
+        <w:tc>
+          <w:tcPr>
+            <w:tcW w:type="dxa" w:w="1700"/>
+            <w:tcMar>
+              <w:top w:type="dxa" w:w="90"/>
+              <w:left w:type="dxa" w:w="140"/>
+              <w:bottom w:type="dxa" w:w="90"/>
+              <w:right w:type="dxa" w:w="140"/>
+            </w:tcMar>
+          </w:tcPr>
+          <w:p>
+            <w:pPr>
+              <w:spacing w:after="0" w:before="0" w:line="276"/>
+            </w:pPr>
+            <w:r>
+              <w:rPr>
+                <w:rFonts w:ascii="Calibri" w:cs="Calibri" w:eastAsia="Calibri" w:hAnsi="Calibri"/>
+                <w:b/>
+                <w:bCs/>
+                <w:color w:val="1A1A14"/>
+                <w:sz w:val="18"/>
+                <w:szCs w:val="18"/>
+              </w:rPr>
+              <w:t xml:space="preserve">3.2:1</w:t>
             </w:r>
           </w:p>
         </w:tc>
@@ -5721,7 +6599,7 @@
                 <w:sz w:val="18"/>
                 <w:szCs w:val="18"/>
               </w:rPr>
-              <w:t xml:space="preserve">Yellow Dark #C49A0A</w:t>
+              <w:t xml:space="preserve">--brand-press #D4900A</w:t>
             </w:r>
           </w:p>
         </w:tc>
@@ -5748,7 +6626,7 @@
                 <w:sz w:val="18"/>
                 <w:szCs w:val="18"/>
               </w:rPr>
-              <w:t xml:space="preserve">White #FFFFFF</w:t>
+              <w:t xml:space="preserve">bianco #FFFFFF</w:t>
             </w:r>
           </w:p>
         </w:tc>
@@ -5775,7 +6653,7 @@
                 <w:sz w:val="18"/>
                 <w:szCs w:val="18"/>
               </w:rPr>
-              <w:t xml:space="preserve">2.6:1</w:t>
+              <w:t xml:space="preserve">2.7:1</w:t>
             </w:r>
           </w:p>
         </w:tc>
@@ -5831,7 +6709,7 @@
                 <w:sz w:val="18"/>
                 <w:szCs w:val="18"/>
               </w:rPr>
-              <w:t xml:space="preserve">Yellow #F7CC49</w:t>
+              <w:t xml:space="preserve">--brand #F7CC49</w:t>
             </w:r>
           </w:p>
         </w:tc>
@@ -5858,7 +6736,7 @@
                 <w:sz w:val="18"/>
                 <w:szCs w:val="18"/>
               </w:rPr>
-              <w:t xml:space="preserve">White #FFFFFF</w:t>
+              <w:t xml:space="preserve">bianco #FFFFFF</w:t>
             </w:r>
           </w:p>
         </w:tc>
@@ -6356,7 +7234,7 @@
           <w:sz w:val="20"/>
           <w:szCs w:val="20"/>
         </w:rPr>
-        <w:t xml:space="preserve">var(--text-muted) si capisce al volo — è il testo di terzo livello. #7A7A60 non dice niente: è solo un numero. Chi rimette mano al codice tra sei mesi — tu compreso — capisce l’intenzione, non solo il valore.</w:t>
+        <w:t xml:space="preserve">var(--text-muted) si capisce al volo — è il testo di terzo livello. #3A3A3A non dice niente: è solo un numero. Chi rimette mano al codice tra sei mesi — tu compreso — capisce l’intenzione, non solo il valore.</w:t>
       </w:r>
     </w:p>
     <w:p>
@@ -6464,7 +7342,7 @@
                 <w:sz w:val="17"/>
                 <w:szCs w:val="17"/>
               </w:rPr>
-              <w:t xml:space="preserve">  --brand:        #F7CC49;</w:t>
+              <w:t xml:space="preserve">  --brand:        #F7CC49;   /* il giallo del logo: azioni, prezzi, ON */</w:t>
             </w:r>
           </w:p>
           <w:p>
@@ -6478,7 +7356,7 @@
                 <w:sz w:val="17"/>
                 <w:szCs w:val="17"/>
               </w:rPr>
-              <w:t xml:space="preserve">  --brand-black:  #222221;   /* il nero del logo, stampa */</w:t>
+              <w:t xml:space="preserve">  --brand-press:  #D4900A;   /* stato premuto dei bottoni gialli */</w:t>
             </w:r>
           </w:p>
           <w:p>
@@ -6492,7 +7370,7 @@
                 <w:sz w:val="17"/>
                 <w:szCs w:val="17"/>
               </w:rPr>
-              <w:t xml:space="preserve">  --brand-dark:   #C49A0A;   /* stato :active dei bottoni gialli */</w:t>
+              <w:t xml:space="preserve">  --brand-dim:    #3A2E00;   /* fondo di badge e pill gialle */</w:t>
             </w:r>
           </w:p>
           <w:p>
@@ -6506,7 +7384,7 @@
                 <w:sz w:val="17"/>
                 <w:szCs w:val="17"/>
               </w:rPr>
-              <w:t xml:space="preserve">  --brand-dim:    #3D2F00;   /* fondo di badge e pill */</w:t>
+              <w:t xml:space="preserve">  --brand-black:  #222221;   /* il nero del logo, per la stampa */</w:t>
             </w:r>
           </w:p>
           <w:p>
@@ -6548,7 +7426,7 @@
                 <w:sz w:val="17"/>
                 <w:szCs w:val="17"/>
               </w:rPr>
-              <w:t xml:space="preserve">  --dark-950:     #0D0D0B;   /* pagina */</w:t>
+              <w:t xml:space="preserve">  --bg-deep:      #0A0A0A;   /* velatura statusbar */</w:t>
             </w:r>
           </w:p>
           <w:p>
@@ -6562,7 +7440,7 @@
                 <w:sz w:val="17"/>
                 <w:szCs w:val="17"/>
               </w:rPr>
-              <w:t xml:space="preserve">  --dark-900:     #1A1A14;   /* card, drawer, sheet */</w:t>
+              <w:t xml:space="preserve">  --bg:           #111111;   /* fondo pagina */</w:t>
             </w:r>
           </w:p>
           <w:p>
@@ -6576,7 +7454,35 @@
                 <w:sz w:val="17"/>
                 <w:szCs w:val="17"/>
               </w:rPr>
-              <w:t xml:space="preserve">  --dark-800:     #2A2A1F;   /* bordi, input */</w:t>
+              <w:t xml:space="preserve">  --surface:      #1C1C1C;   /* card, drawer, bottom sheet */</w:t>
+            </w:r>
+          </w:p>
+          <w:p>
+            <w:pPr>
+              <w:spacing w:after="0" w:line="240"/>
+            </w:pPr>
+            <w:r>
+              <w:rPr>
+                <w:rFonts w:ascii="Consolas" w:cs="Consolas" w:eastAsia="Consolas" w:hAnsi="Consolas"/>
+                <w:color w:val="1A1A14"/>
+                <w:sz w:val="17"/>
+                <w:szCs w:val="17"/>
+              </w:rPr>
+              <w:t xml:space="preserve">  --surface-2:    #252525;   /* input, elementi in primo piano */</w:t>
+            </w:r>
+          </w:p>
+          <w:p>
+            <w:pPr>
+              <w:spacing w:after="0" w:line="240"/>
+            </w:pPr>
+            <w:r>
+              <w:rPr>
+                <w:rFonts w:ascii="Consolas" w:cs="Consolas" w:eastAsia="Consolas" w:hAnsi="Consolas"/>
+                <w:color w:val="1A1A14"/>
+                <w:sz w:val="17"/>
+                <w:szCs w:val="17"/>
+              </w:rPr>
+              <w:t xml:space="preserve">  --border:       #3A3A3A;   /* bordi, separatori */</w:t>
             </w:r>
           </w:p>
           <w:p>
@@ -6618,7 +7524,7 @@
                 <w:sz w:val="17"/>
                 <w:szCs w:val="17"/>
               </w:rPr>
-              <w:t xml:space="preserve">  --text:         #F5F5EF;</w:t>
+              <w:t xml:space="preserve">  --text:         #FFFFFF;</w:t>
             </w:r>
           </w:p>
           <w:p>
@@ -6632,7 +7538,7 @@
                 <w:sz w:val="17"/>
                 <w:szCs w:val="17"/>
               </w:rPr>
-              <w:t xml:space="preserve">  --text-sub:     #C4C4A8;</w:t>
+              <w:t xml:space="preserve">  --text-sub:     rgba(255,255,255,0.60);</w:t>
             </w:r>
           </w:p>
           <w:p>
@@ -6646,7 +7552,21 @@
                 <w:sz w:val="17"/>
                 <w:szCs w:val="17"/>
               </w:rPr>
-              <w:t xml:space="preserve">  --text-muted:   #7A7A60;</w:t>
+              <w:t xml:space="preserve">  --text-muted:   rgba(255,255,255,0.35);</w:t>
+            </w:r>
+          </w:p>
+          <w:p>
+            <w:pPr>
+              <w:spacing w:after="0" w:line="240"/>
+            </w:pPr>
+            <w:r>
+              <w:rPr>
+                <w:rFonts w:ascii="Consolas" w:cs="Consolas" w:eastAsia="Consolas" w:hAnsi="Consolas"/>
+                <w:color w:val="1A1A14"/>
+                <w:sz w:val="17"/>
+                <w:szCs w:val="17"/>
+              </w:rPr>
+              <w:t xml:space="preserve">  --on-brand:     #111111;   /* testo sopra il giallo */</w:t>
             </w:r>
           </w:p>
           <w:p>
@@ -6674,7 +7594,7 @@
                 <w:sz w:val="17"/>
                 <w:szCs w:val="17"/>
               </w:rPr>
-              <w:t xml:space="preserve">  /* Stati */</w:t>
+              <w:t xml:space="preserve">  /* Stati: segnali, non brand. Restano convenzionali */</w:t>
             </w:r>
           </w:p>
           <w:p>
@@ -6688,7 +7608,7 @@
                 <w:sz w:val="17"/>
                 <w:szCs w:val="17"/>
               </w:rPr>
-              <w:t xml:space="preserve">  --success:      #22C55E;</w:t>
+              <w:t xml:space="preserve">  --success:      #4CD964;</w:t>
             </w:r>
           </w:p>
           <w:p>
@@ -6702,7 +7622,7 @@
                 <w:sz w:val="17"/>
                 <w:szCs w:val="17"/>
               </w:rPr>
-              <w:t xml:space="preserve">  --error:        #EF4444;</w:t>
+              <w:t xml:space="preserve">  --success-dim:  #1A3D1A;   /* fondo verde spento */</w:t>
             </w:r>
           </w:p>
           <w:p>
@@ -6716,7 +7636,7 @@
                 <w:sz w:val="17"/>
                 <w:szCs w:val="17"/>
               </w:rPr>
-              <w:t xml:space="preserve">  --live:         #FF4040;</w:t>
+              <w:t xml:space="preserve">  --error:        #EF4444;</w:t>
             </w:r>
           </w:p>
           <w:p>
@@ -6730,7 +7650,35 @@
                 <w:sz w:val="17"/>
                 <w:szCs w:val="17"/>
               </w:rPr>
-              <w:t xml:space="preserve">  --info:         #38BDF8;</w:t>
+              <w:t xml:space="preserve">  --error-soft:   #FF6B61;   /* rosso per testo su fondo scuro */</w:t>
+            </w:r>
+          </w:p>
+          <w:p>
+            <w:pPr>
+              <w:spacing w:after="0" w:line="240"/>
+            </w:pPr>
+            <w:r>
+              <w:rPr>
+                <w:rFonts w:ascii="Consolas" w:cs="Consolas" w:eastAsia="Consolas" w:hAnsi="Consolas"/>
+                <w:color w:val="1A1A14"/>
+                <w:sz w:val="17"/>
+                <w:szCs w:val="17"/>
+              </w:rPr>
+              <w:t xml:space="preserve">  --live:         #FF4040;   /* badge LIVE delle dirette */</w:t>
+            </w:r>
+          </w:p>
+          <w:p>
+            <w:pPr>
+              <w:spacing w:after="0" w:line="240"/>
+            </w:pPr>
+            <w:r>
+              <w:rPr>
+                <w:rFonts w:ascii="Consolas" w:cs="Consolas" w:eastAsia="Consolas" w:hAnsi="Consolas"/>
+                <w:color w:val="1A1A14"/>
+                <w:sz w:val="17"/>
+                <w:szCs w:val="17"/>
+              </w:rPr>
+              <w:t xml:space="preserve">  --info:         #64C8FF;</w:t>
             </w:r>
           </w:p>
           <w:p>
@@ -6752,7 +7700,7 @@
     </w:tbl>
     <w:p>
       <w:pPr>
-        <w:spacing w:after="0" w:before="300" w:line="276"/>
+        <w:spacing w:after="120" w:before="0" w:line="276"/>
       </w:pPr>
       <w:r>
         <w:rPr>
@@ -6762,6 +7710,226 @@
           <w:szCs w:val="20"/>
         </w:rPr>
         <w:t xml:space="preserve"/>
+      </w:r>
+    </w:p>
+    <w:tbl>
+      <w:tblPr>
+        <w:tblW w:type="dxa" w:w="9360"/>
+        <w:tblBorders>
+          <w:top w:val="none" w:color="FFFFFF" w:sz="0"/>
+          <w:left w:val="single" w:color="F7CC49" w:sz="18"/>
+          <w:bottom w:val="none" w:color="FFFFFF" w:sz="0"/>
+          <w:right w:val="none" w:color="FFFFFF" w:sz="0"/>
+          <w:insideH w:val="none" w:color="FFFFFF" w:sz="0"/>
+          <w:insideV w:val="none" w:color="FFFFFF" w:sz="0"/>
+        </w:tblBorders>
+      </w:tblPr>
+      <w:tblGrid>
+        <w:gridCol w:w="9360"/>
+      </w:tblGrid>
+      <w:tr>
+        <w:tc>
+          <w:tcPr>
+            <w:tcW w:type="dxa" w:w="9360"/>
+            <w:shd w:fill="F5F5EF" w:color="auto" w:val="clear"/>
+            <w:tcMar>
+              <w:top w:type="dxa" w:w="160"/>
+              <w:left w:type="dxa" w:w="220"/>
+              <w:bottom w:type="dxa" w:w="160"/>
+              <w:right w:type="dxa" w:w="220"/>
+            </w:tcMar>
+          </w:tcPr>
+          <w:p>
+            <w:pPr>
+              <w:spacing w:after="80" w:before="0" w:line="276"/>
+            </w:pPr>
+            <w:r>
+              <w:rPr>
+                <w:rFonts w:ascii="Calibri" w:cs="Calibri" w:eastAsia="Calibri" w:hAnsi="Calibri"/>
+                <w:b/>
+                <w:bCs/>
+                <w:color w:val="1A1A14"/>
+                <w:sz w:val="20"/>
+                <w:szCs w:val="20"/>
+              </w:rPr>
+              <w:t xml:space="preserve">Com’è andata l’adozione. </w:t>
+            </w:r>
+            <w:r>
+              <w:rPr>
+                <w:rFonts w:ascii="Calibri" w:cs="Calibri" w:eastAsia="Calibri" w:hAnsi="Calibri"/>
+                <w:color w:val="55554A"/>
+                <w:sz w:val="20"/>
+                <w:szCs w:val="20"/>
+              </w:rPr>
+              <w:t xml:space="preserve">Prima di questi token l’app aveva </w:t>
+            </w:r>
+            <w:r>
+              <w:rPr>
+                <w:rFonts w:ascii="Calibri" w:cs="Calibri" w:eastAsia="Calibri" w:hAnsi="Calibri"/>
+                <w:b/>
+                <w:bCs/>
+                <w:color w:val="1A1A14"/>
+                <w:sz w:val="20"/>
+                <w:szCs w:val="20"/>
+              </w:rPr>
+              <w:t xml:space="preserve">142 colori distinti</w:t>
+            </w:r>
+            <w:r>
+              <w:rPr>
+                <w:rFonts w:ascii="Calibri" w:cs="Calibri" w:eastAsia="Calibri" w:hAnsi="Calibri"/>
+                <w:color w:val="55554A"/>
+                <w:sz w:val="20"/>
+                <w:szCs w:val="20"/>
+              </w:rPr>
+              <w:t xml:space="preserve"> — e </w:t>
+            </w:r>
+            <w:r>
+              <w:rPr>
+                <w:rFonts w:ascii="Calibri" w:cs="Calibri" w:eastAsia="Calibri" w:hAnsi="Calibri"/>
+                <w:b/>
+                <w:bCs/>
+                <w:color w:val="1A1A14"/>
+                <w:sz w:val="20"/>
+                <w:szCs w:val="20"/>
+              </w:rPr>
+              <w:t xml:space="preserve">sei gialli diversi</w:t>
+            </w:r>
+            <w:r>
+              <w:rPr>
+                <w:rFonts w:ascii="Calibri" w:cs="Calibri" w:eastAsia="Calibri" w:hAnsi="Calibri"/>
+                <w:color w:val="55554A"/>
+                <w:sz w:val="20"/>
+                <w:szCs w:val="20"/>
+              </w:rPr>
+              <w:t xml:space="preserve">. Il peggiore, #F5D06B, teneva Kings, Beer Pong, Flip Cup, ShotIQ, le card evento e gli inviti su un giallo che non era quello del marchio: 306 elementi a schermo.</w:t>
+            </w:r>
+          </w:p>
+          <w:p>
+            <w:pPr>
+              <w:spacing w:after="80" w:before="0" w:line="276"/>
+            </w:pPr>
+            <w:r>
+              <w:rPr>
+                <w:rFonts w:ascii="Calibri" w:cs="Calibri" w:eastAsia="Calibri" w:hAnsi="Calibri"/>
+                <w:color w:val="55554A"/>
+                <w:sz w:val="20"/>
+                <w:szCs w:val="20"/>
+              </w:rPr>
+              <w:t xml:space="preserve">Ora sono 127, e il giallo è uno solo. Il controllo è stato fatto confrontando l’istogramma dei colori calcolati dal browser prima e dopo: l’unico scostamento è quello voluto.</w:t>
+            </w:r>
+          </w:p>
+        </w:tc>
+      </w:tr>
+    </w:tbl>
+    <w:p>
+      <w:pPr>
+        <w:pStyle w:val="Heading1"/>
+        <w:pBdr>
+          <w:bottom w:val="single" w:color="1A1A14" w:sz="12" w:space="6"/>
+        </w:pBdr>
+        <w:spacing w:after="60" w:before="420"/>
+      </w:pPr>
+      <w:r>
+        <w:rPr>
+          <w:rFonts w:ascii="Calibri" w:cs="Calibri" w:eastAsia="Calibri" w:hAnsi="Calibri"/>
+          <w:b/>
+          <w:bCs/>
+          <w:color w:val="1A1A14"/>
+          <w:sz w:val="30"/>
+          <w:szCs w:val="30"/>
+        </w:rPr>
+        <w:t xml:space="preserve">13 · Cosa resta fuori</w:t>
+      </w:r>
+    </w:p>
+    <w:p>
+      <w:pPr>
+        <w:spacing w:after="200" w:before="0" w:line="276"/>
+      </w:pPr>
+      <w:r>
+        <w:rPr>
+          <w:rFonts w:ascii="Calibri" w:cs="Calibri" w:eastAsia="Calibri" w:hAnsi="Calibri"/>
+          <w:i/>
+          <w:iCs/>
+          <w:color w:val="8A8A78"/>
+          <w:sz w:val="19"/>
+          <w:szCs w:val="19"/>
+        </w:rPr>
+        <w:t xml:space="preserve">Onestà sul perimetro: cosa i token non coprono, e perché.</w:t>
+      </w:r>
+    </w:p>
+    <w:p>
+      <w:pPr>
+        <w:spacing w:after="120" w:before="0" w:line="276"/>
+      </w:pPr>
+      <w:r>
+        <w:rPr>
+          <w:rFonts w:ascii="Calibri" w:cs="Calibri" w:eastAsia="Calibri" w:hAnsi="Calibri"/>
+          <w:b/>
+          <w:bCs/>
+          <w:color w:val="1A1A14"/>
+          <w:sz w:val="20"/>
+          <w:szCs w:val="20"/>
+        </w:rPr>
+        <w:t xml:space="preserve">Gli attributi SVG. </w:t>
+      </w:r>
+      <w:r>
+        <w:rPr>
+          <w:rFonts w:ascii="Calibri" w:cs="Calibri" w:eastAsia="Calibri" w:hAnsi="Calibri"/>
+          <w:color w:val="55554A"/>
+          <w:sz w:val="20"/>
+          <w:szCs w:val="20"/>
+        </w:rPr>
+        <w:t xml:space="preserve">Nella mappa dei tavoli i colori stanno dentro fill="…" e stroke="…", che per specifica non accettano var(). Restano in esadecimale — ma sono stati portati sui valori giusti, quindi il colore è corretto anche se il nome non c’è. Se un giorno quei valori cambiano, vanno cambiati lì a mano: è l’unico punto del file dove serve.</w:t>
+      </w:r>
+    </w:p>
+    <w:p>
+      <w:pPr>
+        <w:spacing w:after="120" w:before="0" w:line="276"/>
+      </w:pPr>
+      <w:r>
+        <w:rPr>
+          <w:rFonts w:ascii="Calibri" w:cs="Calibri" w:eastAsia="Calibri" w:hAnsi="Calibri"/>
+          <w:b/>
+          <w:bCs/>
+          <w:color w:val="1A1A14"/>
+          <w:sz w:val="20"/>
+          <w:szCs w:val="20"/>
+        </w:rPr>
+        <w:t xml:space="preserve">Gli accenti dei singoli giochi. </w:t>
+      </w:r>
+      <w:r>
+        <w:rPr>
+          <w:rFonts w:ascii="Calibri" w:cs="Calibri" w:eastAsia="Calibri" w:hAnsi="Calibri"/>
+          <w:color w:val="55554A"/>
+          <w:sz w:val="20"/>
+          <w:szCs w:val="20"/>
+        </w:rPr>
+        <w:t xml:space="preserve">Il rosa di ShotIQ, l’arancio, il crema: sono scelte deliberate per distinguere un gioco dall’altro, non deriva. Non sono stati toccati. Se un giorno diventano un sistema, avranno i loro token.</w:t>
+      </w:r>
+    </w:p>
+    <w:p>
+      <w:pPr>
+        <w:spacing w:after="200" w:before="0" w:line="276"/>
+      </w:pPr>
+      <w:r>
+        <w:rPr>
+          <w:rFonts w:ascii="Calibri" w:cs="Calibri" w:eastAsia="Calibri" w:hAnsi="Calibri"/>
+          <w:b/>
+          <w:bCs/>
+          <w:color w:val="1A1A14"/>
+          <w:sz w:val="20"/>
+          <w:szCs w:val="20"/>
+        </w:rPr>
+        <w:t xml:space="preserve">Una manciata di grigi. </w:t>
+      </w:r>
+      <w:r>
+        <w:rPr>
+          <w:rFonts w:ascii="Calibri" w:cs="Calibri" w:eastAsia="Calibri" w:hAnsi="Calibri"/>
+          <w:color w:val="55554A"/>
+          <w:sz w:val="20"/>
+          <w:szCs w:val="20"/>
+        </w:rPr>
+        <w:t xml:space="preserve">Restano #333333, #444444, #555555, #777777 e pochi altri, dai 2 ai 17 usi ciascuno. Unificarli avrebbe cambiato l’aspetto di quei punti senza un guadagno vero. Sono candidati per una seconda passata, non un’urgenza.</w:t>
       </w:r>
     </w:p>
     <w:p>
@@ -6778,7 +7946,7 @@
           <w:sz w:val="16"/>
           <w:szCs w:val="16"/>
         </w:rPr>
-        <w:t xml:space="preserve">CAMON · Brand Book — marchi da “Loghi definitivi.svg”</w:t>
+        <w:t xml:space="preserve">CAMON · Brand Book — marchi da “Loghi definitivi.svg” · colori allineati a camon.html</w:t>
       </w:r>
     </w:p>
     <w:sectPr>

</xml_diff>

<commit_message>
Manuale: la regola del fondo unico
Il manuale elencava i fondi ma non diceva la cosa piu' importante:
che ogni pagina deve dichiarare il proprio. E' la lacuna che aveva
lasciato passare nove pagine senza sfondo, tutte a mostrare il nero
del guscio.

Co-Authored-By: Claude Sonnet 4.6 <noreply@anthropic.com>
</commit_message>
<xml_diff>
--- a/brand/CAMON-Brand-Book.docx
+++ b/brand/CAMON-Brand-Book.docx
@@ -3812,6 +3812,75 @@
                 <w:szCs w:val="15"/>
               </w:rPr>
               <w:t xml:space="preserve">oklch(38% 0 0)</w:t>
+            </w:r>
+          </w:p>
+        </w:tc>
+      </w:tr>
+    </w:tbl>
+    <w:p>
+      <w:pPr>
+        <w:spacing w:after="100" w:before="0" w:line="276"/>
+      </w:pPr>
+      <w:r>
+        <w:rPr>
+          <w:rFonts w:ascii="Calibri" w:cs="Calibri" w:eastAsia="Calibri" w:hAnsi="Calibri"/>
+          <w:color w:val="55554A"/>
+          <w:sz w:val="20"/>
+          <w:szCs w:val="20"/>
+        </w:rPr>
+        <w:t xml:space="preserve"/>
+      </w:r>
+    </w:p>
+    <w:tbl>
+      <w:tblPr>
+        <w:tblW w:type="dxa" w:w="9360"/>
+        <w:tblBorders>
+          <w:top w:val="none" w:color="FFFFFF" w:sz="0"/>
+          <w:left w:val="single" w:color="F7CC49" w:sz="18"/>
+          <w:bottom w:val="none" w:color="FFFFFF" w:sz="0"/>
+          <w:right w:val="none" w:color="FFFFFF" w:sz="0"/>
+          <w:insideH w:val="none" w:color="FFFFFF" w:sz="0"/>
+          <w:insideV w:val="none" w:color="FFFFFF" w:sz="0"/>
+        </w:tblBorders>
+      </w:tblPr>
+      <w:tblGrid>
+        <w:gridCol w:w="9360"/>
+      </w:tblGrid>
+      <w:tr>
+        <w:tc>
+          <w:tcPr>
+            <w:tcW w:type="dxa" w:w="9360"/>
+            <w:shd w:fill="F5F5EF" w:color="auto" w:val="clear"/>
+            <w:tcMar>
+              <w:top w:type="dxa" w:w="160"/>
+              <w:left w:type="dxa" w:w="220"/>
+              <w:bottom w:type="dxa" w:w="160"/>
+              <w:right w:type="dxa" w:w="220"/>
+            </w:tcMar>
+          </w:tcPr>
+          <w:p>
+            <w:pPr>
+              <w:spacing w:after="80" w:before="0" w:line="276"/>
+            </w:pPr>
+            <w:r>
+              <w:rPr>
+                <w:rFonts w:ascii="Calibri" w:cs="Calibri" w:eastAsia="Calibri" w:hAnsi="Calibri"/>
+                <w:b/>
+                <w:bCs/>
+                <w:color w:val="1A1A14"/>
+                <w:sz w:val="20"/>
+                <w:szCs w:val="20"/>
+              </w:rPr>
+              <w:t xml:space="preserve">Il fondo è uno solo. </w:t>
+            </w:r>
+            <w:r>
+              <w:rPr>
+                <w:rFonts w:ascii="Calibri" w:cs="Calibri" w:eastAsia="Calibri" w:hAnsi="Calibri"/>
+                <w:color w:val="55554A"/>
+                <w:sz w:val="20"/>
+                <w:szCs w:val="20"/>
+              </w:rPr>
+              <w:t xml:space="preserve">Ogni schermata parte da --bg. Se una pagina non dichiara il proprio fondo finisce per mostrare quello del contenitore sotto, e basta che quello sia diverso perché la pagina sembri di un’altra app: è successo davvero, il guscio era nero pieno e nove pagine lo lasciavano vedere. La home fa eccezione solo in apparenza — ci mette sopra un alone che sale da --surface e si chiude su --bg, quindi ai bordi combacia con tutte le altre.</w:t>
             </w:r>
           </w:p>
         </w:tc>

</xml_diff>